<commit_message>
Documentation adjustments under  INC-28
</commit_message>
<xml_diff>
--- a/docs/Trabajo_de_Grado_2026_ICONTEC_IEEE.docx
+++ b/docs/Trabajo_de_Grado_2026_ICONTEC_IEEE.docx
@@ -4370,7 +4370,37 @@
         <w:rPr>
           <w:rFonts w:eastAsia="Arial" w:cs="Arial"/>
         </w:rPr>
-        <w:t xml:space="preserve">Por esa razón, este trabajo propone construir un prototipo de videojuego educativo en 2D que ponga a los estudiantes frente a retos progresivos diseñados para desarrollar habilidades del pensamiento computacional como la descomposición, la abstracción, el reconocimiento de patrones y el pensamiento algorítmico. El videojuego se desarrolla en Unity con C#, utiliza personajes de la Familia Anonaky como referente visual y se gestiona mediante la metodología Árcade complementada con Kanban, lo que permite trabajar de forma organizada e iterativa con un equipo pequeño y en un tiempo acotado de catorce semanas.</w:t>
+        <w:t xml:space="preserve">Por esa razón, este trabajo propone construir un prototipo de videojuego educativo en 2D que ponga a los estudiantes frente a retos progresivos diseñados para desarrollar habilidades del pensamiento computacional como la descomposición, la abstracción, el reconocimiento de patrones y el pensamiento algorítmico. El videojuego se desarrolla en Unity con C#, </w:t>
+      </w:r>
+      <w:r>
+        <w:rPr>
+          <w:rFonts w:eastAsia="Arial" w:cs="Arial"/>
+        </w:rPr>
+        <w:t xml:space="preserve">utiliza personajes de la Familia </w:t>
+      </w:r>
+      <w:r>
+        <w:rPr>
+          <w:rFonts w:eastAsia="Arial" w:cs="Arial"/>
+        </w:rPr>
+        <w:t>Anonaky</w:t>
+      </w:r>
+      <w:r>
+        <w:rPr>
+          <w:rFonts w:eastAsia="Arial" w:cs="Arial"/>
+        </w:rPr>
+        <w:t xml:space="preserve"> </w:t>
+      </w:r>
+      <w:r>
+        <w:rPr>
+          <w:rFonts w:eastAsia="Arial" w:cs="Arial"/>
+        </w:rPr>
+        <w:t xml:space="preserve">sujeto a la autorización escrita de sus autores, o personajes originales en su defecto </w:t>
+      </w:r>
+      <w:r>
+        <w:rPr>
+          <w:rFonts w:eastAsia="Arial" w:cs="Arial"/>
+        </w:rPr>
+        <w:t>y se gestiona mediante la metodología Árcade complementada con Kanban, lo que permite trabajar de forma organizada e iterativa con un equipo pequeño y en un tiempo acotado de catorce semanas.</w:t>
       </w:r>
     </w:p>
     <w:p>
@@ -4552,20 +4582,946 @@
         <w:t xml:space="preserve">In Colombia, many primary school students reach higher grades without having developed basic logical reasoning and structured problem-solving skills, not because they lack the ability, but because they have rarely had access to tools that work on these competencies deliberately in the classroom. At Colegio El Libertador IED, fourth-grade teachers have identified precisely this situation: their students show difficulties in analysing information, recognising patterns and formulating step-by-step solutions, which is reflected in their performance in both internal assessments and external tests. Faced with this, continuing to do the same does not seem a sufficient option.</w:t>
       </w:r>
     </w:p>
-    <w:p xmlns:wp14="http://schemas.microsoft.com/office/word/2010/wordml" wp14:textId="77777777">
+    <w:p xmlns:wp14="http://schemas.microsoft.com/office/word/2010/wordml" wp14:textId="6ADC0801">
       <w:pPr>
         <w:spacing w:before="0" w:after="240" w:line="240" w:lineRule="auto"/>
         <w:ind w:firstLine="0"/>
         <w:jc w:val="both"/>
         <w:rPr>
           <w:rFonts w:cs="Arial"/>
-        </w:rPr>
-      </w:pPr>
-      <w:r>
-        <w:rPr>
-          <w:rFonts w:cs="Arial"/>
-        </w:rPr>
-        <w:t xml:space="preserve">For this reason, this work proposes building a prototype of a 2D educational video game that places students before progressive challenges designed to develop computational thinking skills such as decomposition, abstraction, pattern recognition and algorithmic thinking. The video game is developed in Unity with C#, uses characters from the Anonaky Family as a visual reference and is managed through the Árcade methodology complemented with Kanban, which makes it possible to work in an organised and iterative way with a small team within a limited time frame of fourteen weeks.</w:t>
+          <w:lang w:val="en-US"/>
+        </w:rPr>
+      </w:pPr>
+      <w:r>
+        <w:rPr>
+          <w:rFonts w:cs="Arial"/>
+          <w:lang w:val="en-US"/>
+        </w:rPr>
+        <w:t>For</w:t>
+      </w:r>
+      <w:r>
+        <w:rPr>
+          <w:rFonts w:cs="Arial"/>
+          <w:lang w:val="en-US"/>
+        </w:rPr>
+        <w:t xml:space="preserve"> </w:t>
+      </w:r>
+      <w:r>
+        <w:rPr>
+          <w:rFonts w:cs="Arial"/>
+          <w:lang w:val="en-US"/>
+        </w:rPr>
+        <w:t>this</w:t>
+      </w:r>
+      <w:r>
+        <w:rPr>
+          <w:rFonts w:cs="Arial"/>
+          <w:lang w:val="en-US"/>
+        </w:rPr>
+        <w:t xml:space="preserve"> </w:t>
+      </w:r>
+      <w:r>
+        <w:rPr>
+          <w:rFonts w:cs="Arial"/>
+          <w:lang w:val="en-US"/>
+        </w:rPr>
+        <w:t>re</w:t>
+      </w:r>
+      <w:r>
+        <w:rPr>
+          <w:rFonts w:cs="Arial"/>
+          <w:lang w:val="en-US"/>
+        </w:rPr>
+        <w:t>aso</w:t>
+      </w:r>
+      <w:r>
+        <w:rPr>
+          <w:rFonts w:cs="Arial"/>
+          <w:lang w:val="en-US"/>
+        </w:rPr>
+        <w:t>n</w:t>
+      </w:r>
+      <w:r>
+        <w:rPr>
+          <w:rFonts w:cs="Arial"/>
+          <w:lang w:val="en-US"/>
+        </w:rPr>
+        <w:t xml:space="preserve">, </w:t>
+      </w:r>
+      <w:r>
+        <w:rPr>
+          <w:rFonts w:cs="Arial"/>
+          <w:lang w:val="en-US"/>
+        </w:rPr>
+        <w:t>thi</w:t>
+      </w:r>
+      <w:r>
+        <w:rPr>
+          <w:rFonts w:cs="Arial"/>
+          <w:lang w:val="en-US"/>
+        </w:rPr>
+        <w:t>s</w:t>
+      </w:r>
+      <w:r>
+        <w:rPr>
+          <w:rFonts w:cs="Arial"/>
+          <w:lang w:val="en-US"/>
+        </w:rPr>
+        <w:t xml:space="preserve"> </w:t>
+      </w:r>
+      <w:r>
+        <w:rPr>
+          <w:rFonts w:cs="Arial"/>
+          <w:lang w:val="en-US"/>
+        </w:rPr>
+        <w:t>work</w:t>
+      </w:r>
+      <w:r>
+        <w:rPr>
+          <w:rFonts w:cs="Arial"/>
+          <w:lang w:val="en-US"/>
+        </w:rPr>
+        <w:t xml:space="preserve"> </w:t>
+      </w:r>
+      <w:r>
+        <w:rPr>
+          <w:rFonts w:cs="Arial"/>
+          <w:lang w:val="en-US"/>
+        </w:rPr>
+        <w:t>propo</w:t>
+      </w:r>
+      <w:r>
+        <w:rPr>
+          <w:rFonts w:cs="Arial"/>
+          <w:lang w:val="en-US"/>
+        </w:rPr>
+        <w:t>ses</w:t>
+      </w:r>
+      <w:r>
+        <w:rPr>
+          <w:rFonts w:cs="Arial"/>
+          <w:lang w:val="en-US"/>
+        </w:rPr>
+        <w:t xml:space="preserve"> </w:t>
+      </w:r>
+      <w:r>
+        <w:rPr>
+          <w:rFonts w:cs="Arial"/>
+          <w:lang w:val="en-US"/>
+        </w:rPr>
+        <w:t>b</w:t>
+      </w:r>
+      <w:r>
+        <w:rPr>
+          <w:rFonts w:cs="Arial"/>
+          <w:lang w:val="en-US"/>
+        </w:rPr>
+        <w:t>u</w:t>
+      </w:r>
+      <w:r>
+        <w:rPr>
+          <w:rFonts w:cs="Arial"/>
+          <w:lang w:val="en-US"/>
+        </w:rPr>
+        <w:t>il</w:t>
+      </w:r>
+      <w:r>
+        <w:rPr>
+          <w:rFonts w:cs="Arial"/>
+          <w:lang w:val="en-US"/>
+        </w:rPr>
+        <w:t>d</w:t>
+      </w:r>
+      <w:r>
+        <w:rPr>
+          <w:rFonts w:cs="Arial"/>
+          <w:lang w:val="en-US"/>
+        </w:rPr>
+        <w:t>ing</w:t>
+      </w:r>
+      <w:r>
+        <w:rPr>
+          <w:rFonts w:cs="Arial"/>
+          <w:lang w:val="en-US"/>
+        </w:rPr>
+        <w:t xml:space="preserve"> a </w:t>
+      </w:r>
+      <w:r>
+        <w:rPr>
+          <w:rFonts w:cs="Arial"/>
+          <w:lang w:val="en-US"/>
+        </w:rPr>
+        <w:t>pr</w:t>
+      </w:r>
+      <w:r>
+        <w:rPr>
+          <w:rFonts w:cs="Arial"/>
+          <w:lang w:val="en-US"/>
+        </w:rPr>
+        <w:t>o</w:t>
+      </w:r>
+      <w:r>
+        <w:rPr>
+          <w:rFonts w:cs="Arial"/>
+          <w:lang w:val="en-US"/>
+        </w:rPr>
+        <w:t>t</w:t>
+      </w:r>
+      <w:r>
+        <w:rPr>
+          <w:rFonts w:cs="Arial"/>
+          <w:lang w:val="en-US"/>
+        </w:rPr>
+        <w:t>ot</w:t>
+      </w:r>
+      <w:r>
+        <w:rPr>
+          <w:rFonts w:cs="Arial"/>
+          <w:lang w:val="en-US"/>
+        </w:rPr>
+        <w:t>y</w:t>
+      </w:r>
+      <w:r>
+        <w:rPr>
+          <w:rFonts w:cs="Arial"/>
+          <w:lang w:val="en-US"/>
+        </w:rPr>
+        <w:t>p</w:t>
+      </w:r>
+      <w:r>
+        <w:rPr>
+          <w:rFonts w:cs="Arial"/>
+          <w:lang w:val="en-US"/>
+        </w:rPr>
+        <w:t>e</w:t>
+      </w:r>
+      <w:r>
+        <w:rPr>
+          <w:rFonts w:cs="Arial"/>
+          <w:lang w:val="en-US"/>
+        </w:rPr>
+        <w:t xml:space="preserve"> </w:t>
+      </w:r>
+      <w:r>
+        <w:rPr>
+          <w:rFonts w:cs="Arial"/>
+          <w:lang w:val="en-US"/>
+        </w:rPr>
+        <w:t>o</w:t>
+      </w:r>
+      <w:r>
+        <w:rPr>
+          <w:rFonts w:cs="Arial"/>
+          <w:lang w:val="en-US"/>
+        </w:rPr>
+        <w:t>f</w:t>
+      </w:r>
+      <w:r>
+        <w:rPr>
+          <w:rFonts w:cs="Arial"/>
+          <w:lang w:val="en-US"/>
+        </w:rPr>
+        <w:t xml:space="preserve"> a</w:t>
+      </w:r>
+      <w:r>
+        <w:rPr>
+          <w:rFonts w:cs="Arial"/>
+          <w:lang w:val="en-US"/>
+        </w:rPr>
+        <w:t xml:space="preserve"> 2</w:t>
+      </w:r>
+      <w:r>
+        <w:rPr>
+          <w:rFonts w:cs="Arial"/>
+          <w:lang w:val="en-US"/>
+        </w:rPr>
+        <w:t>D</w:t>
+      </w:r>
+      <w:r>
+        <w:rPr>
+          <w:rFonts w:cs="Arial"/>
+          <w:lang w:val="en-US"/>
+        </w:rPr>
+        <w:t xml:space="preserve"> </w:t>
+      </w:r>
+      <w:r>
+        <w:rPr>
+          <w:rFonts w:cs="Arial"/>
+          <w:lang w:val="en-US"/>
+        </w:rPr>
+        <w:t>e</w:t>
+      </w:r>
+      <w:r>
+        <w:rPr>
+          <w:rFonts w:cs="Arial"/>
+          <w:lang w:val="en-US"/>
+        </w:rPr>
+        <w:t>d</w:t>
+      </w:r>
+      <w:r>
+        <w:rPr>
+          <w:rFonts w:cs="Arial"/>
+          <w:lang w:val="en-US"/>
+        </w:rPr>
+        <w:t>uca</w:t>
+      </w:r>
+      <w:r>
+        <w:rPr>
+          <w:rFonts w:cs="Arial"/>
+          <w:lang w:val="en-US"/>
+        </w:rPr>
+        <w:t>t</w:t>
+      </w:r>
+      <w:r>
+        <w:rPr>
+          <w:rFonts w:cs="Arial"/>
+          <w:lang w:val="en-US"/>
+        </w:rPr>
+        <w:t>i</w:t>
+      </w:r>
+      <w:r>
+        <w:rPr>
+          <w:rFonts w:cs="Arial"/>
+          <w:lang w:val="en-US"/>
+        </w:rPr>
+        <w:t>o</w:t>
+      </w:r>
+      <w:r>
+        <w:rPr>
+          <w:rFonts w:cs="Arial"/>
+          <w:lang w:val="en-US"/>
+        </w:rPr>
+        <w:t>na</w:t>
+      </w:r>
+      <w:r>
+        <w:rPr>
+          <w:rFonts w:cs="Arial"/>
+          <w:lang w:val="en-US"/>
+        </w:rPr>
+        <w:t>l</w:t>
+      </w:r>
+      <w:r>
+        <w:rPr>
+          <w:rFonts w:cs="Arial"/>
+          <w:lang w:val="en-US"/>
+        </w:rPr>
+        <w:t xml:space="preserve"> v</w:t>
+      </w:r>
+      <w:r>
+        <w:rPr>
+          <w:rFonts w:cs="Arial"/>
+          <w:lang w:val="en-US"/>
+        </w:rPr>
+        <w:t>id</w:t>
+      </w:r>
+      <w:r>
+        <w:rPr>
+          <w:rFonts w:cs="Arial"/>
+          <w:lang w:val="en-US"/>
+        </w:rPr>
+        <w:t>e</w:t>
+      </w:r>
+      <w:r>
+        <w:rPr>
+          <w:rFonts w:cs="Arial"/>
+          <w:lang w:val="en-US"/>
+        </w:rPr>
+        <w:t xml:space="preserve">o </w:t>
+      </w:r>
+      <w:r>
+        <w:rPr>
+          <w:rFonts w:cs="Arial"/>
+          <w:lang w:val="en-US"/>
+        </w:rPr>
+        <w:t>ga</w:t>
+      </w:r>
+      <w:r>
+        <w:rPr>
+          <w:rFonts w:cs="Arial"/>
+          <w:lang w:val="en-US"/>
+        </w:rPr>
+        <w:t>m</w:t>
+      </w:r>
+      <w:r>
+        <w:rPr>
+          <w:rFonts w:cs="Arial"/>
+          <w:lang w:val="en-US"/>
+        </w:rPr>
+        <w:t>e</w:t>
+      </w:r>
+      <w:r>
+        <w:rPr>
+          <w:rFonts w:cs="Arial"/>
+          <w:lang w:val="en-US"/>
+        </w:rPr>
+        <w:t xml:space="preserve"> </w:t>
+      </w:r>
+      <w:r>
+        <w:rPr>
+          <w:rFonts w:cs="Arial"/>
+          <w:lang w:val="en-US"/>
+        </w:rPr>
+        <w:t>t</w:t>
+      </w:r>
+      <w:r>
+        <w:rPr>
+          <w:rFonts w:cs="Arial"/>
+          <w:lang w:val="en-US"/>
+        </w:rPr>
+        <w:t>h</w:t>
+      </w:r>
+      <w:r>
+        <w:rPr>
+          <w:rFonts w:cs="Arial"/>
+          <w:lang w:val="en-US"/>
+        </w:rPr>
+        <w:t>a</w:t>
+      </w:r>
+      <w:r>
+        <w:rPr>
+          <w:rFonts w:cs="Arial"/>
+          <w:lang w:val="en-US"/>
+        </w:rPr>
+        <w:t>t</w:t>
+      </w:r>
+      <w:r>
+        <w:rPr>
+          <w:rFonts w:cs="Arial"/>
+          <w:lang w:val="en-US"/>
+        </w:rPr>
+        <w:t xml:space="preserve"> </w:t>
+      </w:r>
+      <w:r>
+        <w:rPr>
+          <w:rFonts w:cs="Arial"/>
+          <w:lang w:val="en-US"/>
+        </w:rPr>
+        <w:t>pla</w:t>
+      </w:r>
+      <w:r>
+        <w:rPr>
+          <w:rFonts w:cs="Arial"/>
+          <w:lang w:val="en-US"/>
+        </w:rPr>
+        <w:t>ce</w:t>
+      </w:r>
+      <w:r>
+        <w:rPr>
+          <w:rFonts w:cs="Arial"/>
+          <w:lang w:val="en-US"/>
+        </w:rPr>
+        <w:t>s</w:t>
+      </w:r>
+      <w:r>
+        <w:rPr>
+          <w:rFonts w:cs="Arial"/>
+          <w:lang w:val="en-US"/>
+        </w:rPr>
+        <w:t xml:space="preserve"> </w:t>
+      </w:r>
+      <w:r>
+        <w:rPr>
+          <w:rFonts w:cs="Arial"/>
+          <w:lang w:val="en-US"/>
+        </w:rPr>
+        <w:t>st</w:t>
+      </w:r>
+      <w:r>
+        <w:rPr>
+          <w:rFonts w:cs="Arial"/>
+          <w:lang w:val="en-US"/>
+        </w:rPr>
+        <w:t>u</w:t>
+      </w:r>
+      <w:r>
+        <w:rPr>
+          <w:rFonts w:cs="Arial"/>
+          <w:lang w:val="en-US"/>
+        </w:rPr>
+        <w:t>d</w:t>
+      </w:r>
+      <w:r>
+        <w:rPr>
+          <w:rFonts w:cs="Arial"/>
+          <w:lang w:val="en-US"/>
+        </w:rPr>
+        <w:t>e</w:t>
+      </w:r>
+      <w:r>
+        <w:rPr>
+          <w:rFonts w:cs="Arial"/>
+          <w:lang w:val="en-US"/>
+        </w:rPr>
+        <w:t>n</w:t>
+      </w:r>
+      <w:r>
+        <w:rPr>
+          <w:rFonts w:cs="Arial"/>
+          <w:lang w:val="en-US"/>
+        </w:rPr>
+        <w:t>ts</w:t>
+      </w:r>
+      <w:r>
+        <w:rPr>
+          <w:rFonts w:cs="Arial"/>
+          <w:lang w:val="en-US"/>
+        </w:rPr>
+        <w:t xml:space="preserve"> </w:t>
+      </w:r>
+      <w:r>
+        <w:rPr>
+          <w:rFonts w:cs="Arial"/>
+          <w:lang w:val="en-US"/>
+        </w:rPr>
+        <w:t>be</w:t>
+      </w:r>
+      <w:r>
+        <w:rPr>
+          <w:rFonts w:cs="Arial"/>
+          <w:lang w:val="en-US"/>
+        </w:rPr>
+        <w:t>f</w:t>
+      </w:r>
+      <w:r>
+        <w:rPr>
+          <w:rFonts w:cs="Arial"/>
+          <w:lang w:val="en-US"/>
+        </w:rPr>
+        <w:t>or</w:t>
+      </w:r>
+      <w:r>
+        <w:rPr>
+          <w:rFonts w:cs="Arial"/>
+          <w:lang w:val="en-US"/>
+        </w:rPr>
+        <w:t>e</w:t>
+      </w:r>
+      <w:r>
+        <w:rPr>
+          <w:rFonts w:cs="Arial"/>
+          <w:lang w:val="en-US"/>
+        </w:rPr>
+        <w:t xml:space="preserve"> </w:t>
+      </w:r>
+      <w:r>
+        <w:rPr>
+          <w:rFonts w:cs="Arial"/>
+          <w:lang w:val="en-US"/>
+        </w:rPr>
+        <w:t>pr</w:t>
+      </w:r>
+      <w:r>
+        <w:rPr>
+          <w:rFonts w:cs="Arial"/>
+          <w:lang w:val="en-US"/>
+        </w:rPr>
+        <w:t>og</w:t>
+      </w:r>
+      <w:r>
+        <w:rPr>
+          <w:rFonts w:cs="Arial"/>
+          <w:lang w:val="en-US"/>
+        </w:rPr>
+        <w:t>re</w:t>
+      </w:r>
+      <w:r>
+        <w:rPr>
+          <w:rFonts w:cs="Arial"/>
+          <w:lang w:val="en-US"/>
+        </w:rPr>
+        <w:t>ss</w:t>
+      </w:r>
+      <w:r>
+        <w:rPr>
+          <w:rFonts w:cs="Arial"/>
+          <w:lang w:val="en-US"/>
+        </w:rPr>
+        <w:t>i</w:t>
+      </w:r>
+      <w:r>
+        <w:rPr>
+          <w:rFonts w:cs="Arial"/>
+          <w:lang w:val="en-US"/>
+        </w:rPr>
+        <w:t>ve</w:t>
+      </w:r>
+      <w:r>
+        <w:rPr>
+          <w:rFonts w:cs="Arial"/>
+          <w:lang w:val="en-US"/>
+        </w:rPr>
+        <w:t xml:space="preserve"> </w:t>
+      </w:r>
+      <w:r>
+        <w:rPr>
+          <w:rFonts w:cs="Arial"/>
+          <w:lang w:val="en-US"/>
+        </w:rPr>
+        <w:t>challen</w:t>
+      </w:r>
+      <w:r>
+        <w:rPr>
+          <w:rFonts w:cs="Arial"/>
+          <w:lang w:val="en-US"/>
+        </w:rPr>
+        <w:t>ges</w:t>
+      </w:r>
+      <w:r>
+        <w:rPr>
+          <w:rFonts w:cs="Arial"/>
+          <w:lang w:val="en-US"/>
+        </w:rPr>
+        <w:t xml:space="preserve"> </w:t>
+      </w:r>
+      <w:r>
+        <w:rPr>
+          <w:rFonts w:cs="Arial"/>
+          <w:lang w:val="en-US"/>
+        </w:rPr>
+        <w:t>desi</w:t>
+      </w:r>
+      <w:r>
+        <w:rPr>
+          <w:rFonts w:cs="Arial"/>
+          <w:lang w:val="en-US"/>
+        </w:rPr>
+        <w:t>gn</w:t>
+      </w:r>
+      <w:r>
+        <w:rPr>
+          <w:rFonts w:cs="Arial"/>
+          <w:lang w:val="en-US"/>
+        </w:rPr>
+        <w:t>ed</w:t>
+      </w:r>
+      <w:r>
+        <w:rPr>
+          <w:rFonts w:cs="Arial"/>
+          <w:lang w:val="en-US"/>
+        </w:rPr>
+        <w:t xml:space="preserve"> </w:t>
+      </w:r>
+      <w:r>
+        <w:rPr>
+          <w:rFonts w:cs="Arial"/>
+          <w:lang w:val="en-US"/>
+        </w:rPr>
+        <w:t>to</w:t>
+      </w:r>
+      <w:r>
+        <w:rPr>
+          <w:rFonts w:cs="Arial"/>
+          <w:lang w:val="en-US"/>
+        </w:rPr>
+        <w:t xml:space="preserve"> </w:t>
+      </w:r>
+      <w:r>
+        <w:rPr>
+          <w:rFonts w:cs="Arial"/>
+          <w:lang w:val="en-US"/>
+        </w:rPr>
+        <w:t>develop</w:t>
+      </w:r>
+      <w:r>
+        <w:rPr>
+          <w:rFonts w:cs="Arial"/>
+          <w:lang w:val="en-US"/>
+        </w:rPr>
+        <w:t xml:space="preserve"> </w:t>
+      </w:r>
+      <w:r>
+        <w:rPr>
+          <w:rFonts w:cs="Arial"/>
+          <w:lang w:val="en-US"/>
+        </w:rPr>
+        <w:t>comput</w:t>
+      </w:r>
+      <w:r>
+        <w:rPr>
+          <w:rFonts w:cs="Arial"/>
+          <w:lang w:val="en-US"/>
+        </w:rPr>
+        <w:t>at</w:t>
+      </w:r>
+      <w:r>
+        <w:rPr>
+          <w:rFonts w:cs="Arial"/>
+          <w:lang w:val="en-US"/>
+        </w:rPr>
+        <w:t>i</w:t>
+      </w:r>
+      <w:r>
+        <w:rPr>
+          <w:rFonts w:cs="Arial"/>
+          <w:lang w:val="en-US"/>
+        </w:rPr>
+        <w:t>onal</w:t>
+      </w:r>
+      <w:r>
+        <w:rPr>
+          <w:rFonts w:cs="Arial"/>
+          <w:lang w:val="en-US"/>
+        </w:rPr>
+        <w:t xml:space="preserve"> </w:t>
+      </w:r>
+      <w:r>
+        <w:rPr>
+          <w:rFonts w:cs="Arial"/>
+          <w:lang w:val="en-US"/>
+        </w:rPr>
+        <w:t>t</w:t>
+      </w:r>
+      <w:r>
+        <w:rPr>
+          <w:rFonts w:cs="Arial"/>
+          <w:lang w:val="en-US"/>
+        </w:rPr>
+        <w:t>hin</w:t>
+      </w:r>
+      <w:r>
+        <w:rPr>
+          <w:rFonts w:cs="Arial"/>
+          <w:lang w:val="en-US"/>
+        </w:rPr>
+        <w:t>ki</w:t>
+      </w:r>
+      <w:r>
+        <w:rPr>
+          <w:rFonts w:cs="Arial"/>
+          <w:lang w:val="en-US"/>
+        </w:rPr>
+        <w:t>n</w:t>
+      </w:r>
+      <w:r>
+        <w:rPr>
+          <w:rFonts w:cs="Arial"/>
+          <w:lang w:val="en-US"/>
+        </w:rPr>
+        <w:t>g</w:t>
+      </w:r>
+      <w:r>
+        <w:rPr>
+          <w:rFonts w:cs="Arial"/>
+          <w:lang w:val="en-US"/>
+        </w:rPr>
+        <w:t xml:space="preserve"> </w:t>
+      </w:r>
+      <w:r>
+        <w:rPr>
+          <w:rFonts w:cs="Arial"/>
+          <w:lang w:val="en-US"/>
+        </w:rPr>
+        <w:t>sk</w:t>
+      </w:r>
+      <w:r>
+        <w:rPr>
+          <w:rFonts w:cs="Arial"/>
+          <w:lang w:val="en-US"/>
+        </w:rPr>
+        <w:t>ills</w:t>
+      </w:r>
+      <w:r>
+        <w:rPr>
+          <w:rFonts w:cs="Arial"/>
+          <w:lang w:val="en-US"/>
+        </w:rPr>
+        <w:t xml:space="preserve"> </w:t>
+      </w:r>
+      <w:r>
+        <w:rPr>
+          <w:rFonts w:cs="Arial"/>
+          <w:lang w:val="en-US"/>
+        </w:rPr>
+        <w:t>such</w:t>
+      </w:r>
+      <w:r>
+        <w:rPr>
+          <w:rFonts w:cs="Arial"/>
+          <w:lang w:val="en-US"/>
+        </w:rPr>
+        <w:t xml:space="preserve"> as </w:t>
+      </w:r>
+      <w:r>
+        <w:rPr>
+          <w:rFonts w:cs="Arial"/>
+          <w:lang w:val="en-US"/>
+        </w:rPr>
+        <w:t>decomposi</w:t>
+      </w:r>
+      <w:r>
+        <w:rPr>
+          <w:rFonts w:cs="Arial"/>
+          <w:lang w:val="en-US"/>
+        </w:rPr>
+        <w:t>t</w:t>
+      </w:r>
+      <w:r>
+        <w:rPr>
+          <w:rFonts w:cs="Arial"/>
+          <w:lang w:val="en-US"/>
+        </w:rPr>
+        <w:t>ion</w:t>
+      </w:r>
+      <w:r>
+        <w:rPr>
+          <w:rFonts w:cs="Arial"/>
+          <w:lang w:val="en-US"/>
+        </w:rPr>
+        <w:t xml:space="preserve">, </w:t>
+      </w:r>
+      <w:r>
+        <w:rPr>
+          <w:rFonts w:cs="Arial"/>
+          <w:lang w:val="en-US"/>
+        </w:rPr>
+        <w:t>a</w:t>
+      </w:r>
+      <w:r>
+        <w:rPr>
+          <w:rFonts w:cs="Arial"/>
+          <w:lang w:val="en-US"/>
+        </w:rPr>
+        <w:t>bs</w:t>
+      </w:r>
+      <w:r>
+        <w:rPr>
+          <w:rFonts w:cs="Arial"/>
+          <w:lang w:val="en-US"/>
+        </w:rPr>
+        <w:t>traction</w:t>
+      </w:r>
+      <w:r>
+        <w:rPr>
+          <w:rFonts w:cs="Arial"/>
+          <w:lang w:val="en-US"/>
+        </w:rPr>
+        <w:t>,</w:t>
+      </w:r>
+      <w:r>
+        <w:rPr>
+          <w:rFonts w:cs="Arial"/>
+          <w:lang w:val="en-US"/>
+        </w:rPr>
+        <w:t xml:space="preserve"> </w:t>
+      </w:r>
+      <w:r>
+        <w:rPr>
+          <w:rFonts w:cs="Arial"/>
+          <w:lang w:val="en-US"/>
+        </w:rPr>
+        <w:t>pa</w:t>
+      </w:r>
+      <w:r>
+        <w:rPr>
+          <w:rFonts w:cs="Arial"/>
+          <w:lang w:val="en-US"/>
+        </w:rPr>
+        <w:t>ttern</w:t>
+      </w:r>
+      <w:r>
+        <w:rPr>
+          <w:rFonts w:cs="Arial"/>
+          <w:lang w:val="en-US"/>
+        </w:rPr>
+        <w:t xml:space="preserve"> </w:t>
+      </w:r>
+      <w:r>
+        <w:rPr>
+          <w:rFonts w:cs="Arial"/>
+          <w:lang w:val="en-US"/>
+        </w:rPr>
+        <w:t>rec</w:t>
+      </w:r>
+      <w:r>
+        <w:rPr>
+          <w:rFonts w:cs="Arial"/>
+          <w:lang w:val="en-US"/>
+        </w:rPr>
+        <w:t>ognition</w:t>
+      </w:r>
+      <w:r>
+        <w:rPr>
+          <w:rFonts w:cs="Arial"/>
+          <w:lang w:val="en-US"/>
+        </w:rPr>
+        <w:t xml:space="preserve"> an</w:t>
+      </w:r>
+      <w:r>
+        <w:rPr>
+          <w:rFonts w:cs="Arial"/>
+          <w:lang w:val="en-US"/>
+        </w:rPr>
+        <w:t xml:space="preserve">d </w:t>
+      </w:r>
+      <w:r>
+        <w:rPr>
+          <w:rFonts w:cs="Arial"/>
+          <w:lang w:val="en-US"/>
+        </w:rPr>
+        <w:t>algorithmic</w:t>
+      </w:r>
+      <w:r>
+        <w:rPr>
+          <w:rFonts w:cs="Arial"/>
+          <w:lang w:val="en-US"/>
+        </w:rPr>
+        <w:t xml:space="preserve"> </w:t>
+      </w:r>
+      <w:r>
+        <w:rPr>
+          <w:rFonts w:cs="Arial"/>
+          <w:lang w:val="en-US"/>
+        </w:rPr>
+        <w:t>thinking</w:t>
+      </w:r>
+      <w:r>
+        <w:rPr>
+          <w:rFonts w:cs="Arial"/>
+          <w:lang w:val="en-US"/>
+        </w:rPr>
+        <w:t>. T</w:t>
+      </w:r>
+      <w:r>
+        <w:rPr>
+          <w:rFonts w:cs="Arial"/>
+          <w:lang w:val="en-US"/>
+        </w:rPr>
+        <w:t xml:space="preserve"> The video game is developed in Unity using C# and features characters from the Anonaky Family, subject to the written authorization of their creators, or original characters where such authorization is not available</w:t>
+      </w:r>
+      <w:r>
+        <w:rPr>
+          <w:rFonts w:cs="Arial"/>
+          <w:lang w:val="en-US"/>
+        </w:rPr>
+        <w:t xml:space="preserve"> and is manag</w:t>
+      </w:r>
+      <w:r>
+        <w:rPr>
+          <w:rFonts w:cs="Arial"/>
+          <w:lang w:val="en-US"/>
+        </w:rPr>
+        <w:t>ed thro</w:t>
+      </w:r>
+      <w:r>
+        <w:rPr>
+          <w:rFonts w:cs="Arial"/>
+          <w:lang w:val="en-US"/>
+        </w:rPr>
+        <w:t xml:space="preserve">ugh the Árcade methodology complemented with Kanban, which makes it possible to </w:t>
+      </w:r>
+      <w:r>
+        <w:rPr>
+          <w:rFonts w:cs="Arial"/>
+          <w:lang w:val="en-US"/>
+        </w:rPr>
+        <w:t>work</w:t>
+      </w:r>
+      <w:r>
+        <w:rPr>
+          <w:rFonts w:cs="Arial"/>
+          <w:lang w:val="en-US"/>
+        </w:rPr>
+        <w:t xml:space="preserve"> in an organised and iterative way with a small team within a limited time frame of fourteen weeks.</w:t>
       </w:r>
     </w:p>
     <w:p xmlns:wp14="http://schemas.microsoft.com/office/word/2010/wordml" wp14:textId="77777777">
@@ -11494,7 +12450,31 @@
         <w:rPr>
           <w:rFonts w:eastAsia="Arial" w:cs="Arial"/>
         </w:rPr>
-        <w:t>El videojuego almacenará el nombre de los estudiantes de grado cuarto del Colegio El Libertador IED con el exclusivo fin de vincular el avance y las puntuaciones de cada usuario a su perfil dentro del juego. Al tratarse de información personal de menores de edad, su recopilación y utilización se encuentran sujetas a un conjunto de disposiciones que el proyecto debe observar en todas sus etapas y que se detallan a continuación:</w:t>
+        <w:t xml:space="preserve">El videojuego almacenará el nombre de los estudiantes de grado cuarto del Colegio El Libertador IED </w:t>
+      </w:r>
+      <w:r>
+        <w:rPr>
+          <w:rFonts w:eastAsia="Arial" w:cs="Arial"/>
+        </w:rPr>
+        <w:t>con el exclusivo fin de vincular el</w:t>
+      </w:r>
+      <w:r>
+        <w:rPr>
+          <w:rFonts w:eastAsia="Arial" w:cs="Arial"/>
+        </w:rPr>
+        <w:t xml:space="preserve"> avance y </w:t>
+      </w:r>
+      <w:r>
+        <w:rPr>
+          <w:rFonts w:eastAsia="Arial" w:cs="Arial"/>
+        </w:rPr>
+        <w:t>los indicadores de desempeño</w:t>
+      </w:r>
+      <w:r>
+        <w:rPr>
+          <w:rFonts w:eastAsia="Arial" w:cs="Arial"/>
+        </w:rPr>
+        <w:t xml:space="preserve"> de cada usuario a su perfil dentro del juego. Al tratarse de información personal de menores de edad, su recopilación y utilización se encuentran sujetas a un conjunto de disposiciones que el proyecto debe observar en todas sus etapas y que se detallan a continuación:</w:t>
       </w:r>
     </w:p>
     <w:p/>
@@ -13838,6 +14818,54 @@
           <w:rFonts w:eastAsia="Arial" w:cs="Arial"/>
         </w:rPr>
         <w:t xml:space="preserve"> será el lenguaje de programación empleado para la implementación de la lógica del juego, la gestión de los niveles y el comportamiento de los elementos interactivos dentro del entorno de Unity.</w:t>
+      </w:r>
+    </w:p>
+    <w:p>
+      <w:pPr>
+        <w:pStyle w:val="Prrafodelista"/>
+        <w:numPr>
+          <w:ilvl w:val="0"/>
+          <w:numId w:val="4"/>
+        </w:numPr>
+        <w:suppressLineNumbers w:val="0"/>
+        <w:bidi w:val="0"/>
+        <w:spacing w:before="240" w:beforeAutospacing="off" w:after="240" w:afterAutospacing="off" w:line="240" w:lineRule="auto"/>
+        <w:ind w:left="720" w:right="0" w:hanging="360"/>
+        <w:jc w:val="both"/>
+        <w:rPr/>
+      </w:pPr>
+      <w:r>
+        <w:rPr/>
+        <w:t>Como recurso gráfico y conceptual</w:t>
+      </w:r>
+      <w:r>
+        <w:rPr>
+          <w:rFonts w:eastAsia="Arial" w:cs="Arial"/>
+        </w:rPr>
+        <w:t xml:space="preserve">, se hará uso del libro “Tecnología Para niños”, </w:t>
+      </w:r>
+      <w:r>
+        <w:rPr/>
+        <w:t>cuyos personajes e ilustraciones servirán como base para el diseño visual de los personajes del videojuego</w:t>
+      </w:r>
+      <w:r>
+        <w:rPr/>
+        <w:t xml:space="preserve"> </w:t>
+      </w:r>
+      <w:r>
+        <w:rPr/>
+        <w:t xml:space="preserve">una vez obtenida la autorización escrita de sus autores (3.3.2); en </w:t>
+      </w:r>
+      <w:r>
+        <w:rPr>
+          <w:noProof w:val="0"/>
+          <w:lang w:val="es-CO"/>
+        </w:rPr>
+        <w:t>su defecto se emplean personajes originales</w:t>
+      </w:r>
+      <w:r>
+        <w:rPr/>
+        <w:t>, asegurando coherencia entre la propuesta narrativa y los elementos gráficos del proyecto.</w:t>
       </w:r>
     </w:p>
     <w:p>
@@ -13852,31 +14880,6 @@
       </w:pPr>
       <w:r>
         <w:rPr/>
-        <w:t>Como recurso gráfico y conceptual</w:t>
-      </w:r>
-      <w:r>
-        <w:rPr>
-          <w:rFonts w:eastAsia="Arial" w:cs="Arial"/>
-        </w:rPr>
-        <w:t xml:space="preserve">, se hará uso del libro “Tecnología Para niños”, </w:t>
-      </w:r>
-      <w:r>
-        <w:rPr/>
-        <w:t xml:space="preserve">cuyos personajes e ilustraciones servirán como base para el diseño visual de los personajes del videojuego, asegurando coherencia entre la propuesta narrativa y los elementos gráficos del proyecto.</w:t>
-      </w:r>
-    </w:p>
-    <w:p>
-      <w:pPr>
-        <w:pStyle w:val="Prrafodelista"/>
-        <w:numPr>
-          <w:ilvl w:val="0"/>
-          <w:numId w:val="4"/>
-        </w:numPr>
-        <w:spacing w:before="240" w:after="240"/>
-        <w:rPr/>
-      </w:pPr>
-      <w:r>
-        <w:rPr/>
         <w:t xml:space="preserve">Finalmente, </w:t>
       </w:r>
       <w:r>
@@ -13975,7 +14978,25 @@
         <w:rPr>
           <w:rFonts w:eastAsia="Arial" w:cs="Arial"/>
         </w:rPr>
-        <w:t xml:space="preserve">La muestra estará compuesta por un grupo de estudiantes de grado cuarto de primaria disponibles para participar en las sesiones de prueba del prototipo, seleccionados según criterios de accesibilidad y disposición de la institución educativa. Este enfoque permite obtener retroalimentación cualitativa y cuantitativa relevante sobre la experiencia de usuario y el cumplimiento de los objetivos pedagógicos del videojuego, sin comprometer la validez del proceso investigativo.</w:t>
+        <w:t>La muestra estará compuesta</w:t>
+      </w:r>
+      <w:r>
+        <w:rPr>
+          <w:rFonts w:eastAsia="Arial" w:cs="Arial"/>
+        </w:rPr>
+        <w:t xml:space="preserve"> por un grupo de estudiantes de grado cuarto de primaria disponibles para participar en las sesiones de prueba del prototipo, seleccionados según criterios de accesibilidad y disposición de la institución educativa</w:t>
+      </w:r>
+      <w:r>
+        <w:rPr>
+          <w:rFonts w:eastAsia="Arial" w:cs="Arial"/>
+        </w:rPr>
+        <w:t>, las sesiones con estudiantes tienen carácter de verificación funcional y de usabilidad del prototipo: permiten observar si la interfaz resulta comprensible y si la ruta principal se completa sin bloqueos. No constituyen una medición del efecto del videojuego sobre el desarrollo del pensamiento computacional</w:t>
+      </w:r>
+      <w:r>
+        <w:rPr>
+          <w:rFonts w:eastAsia="Arial" w:cs="Arial"/>
+        </w:rPr>
+        <w:t>. Este enfoque permite obtener retroalimentación cualitativa y cuantitativa relevante sobre la experiencia de usuario y el cumplimiento de los objetivos pedagógicos del videojuego, sin comprometer la validez del proceso investigativo.</w:t>
       </w:r>
     </w:p>
     <w:p>

</xml_diff>